<commit_message>
Add final portfolio with supplied details filled in
Co-Authored-By: Claude Sonnet 5.5 <noreply@anthropic.com>
Claude-Session: https://claude.ai/code/session_01GPDgMcFkQEKAntj1yaW626
</commit_message>
<xml_diff>
--- a/Professional_Portfolio_-_Final.docx
+++ b/Professional_Portfolio_-_Final.docx
@@ -101,7 +101,7 @@
         <w:t xml:space="preserve"> </w:t>
       </w:r>
       <w:r>
-        <w:t xml:space="preserve">I once thought unequal access to care was mainly a shortage of staff and equipment. Dahlgren and Whitehead’s (1991) layered model, the World Health Organization Commission on Social Determinants of Health (2008) and Marmot et al. (2020) argue instead that income, housing and power shape who reaches care. This reframed what I had seen of rural access in Nepal, although the model explains care-home inequalities less well, where staffing patterns and supervision appear to matter as much as social position. I now ask what in the system produces a difference before attributing it to individuals, because a barrier I read as a person’s choice may be one the service built. On one shift a resident often declined personal care at breakfast. The timing was the problem, so I raised their preference with a senior and the routine changed.</w:t>
+        <w:t xml:space="preserve">I once thought unequal access to care was mainly a shortage of staff and equipment. Dahlgren and Whitehead’s (1991) layered model, the World Health Organization Commission on Social Determinants of Health (2008) and Marmot et al. (2020) argue instead that income, housing and power shape who reaches care. This reframed what I had seen of rural access in Nepal, although the model explains care-home inequalities less well, where staffing patterns and supervision appear to matter as much as social position. I now ask what in the system produces a difference before attributing it to individuals, because a barrier I read as a person’s choice, such as a missed appointment, may be one the service built. On the ward, one patient regularly declined help with washing at breakfast. I discussed their preferred timing with the nurse in charge, so care could fit their routine.</w:t>
       </w:r>
     </w:p>
     <w:p>
@@ -119,7 +119,7 @@
         <w:t xml:space="preserve"> </w:t>
       </w:r>
       <w:r>
-        <w:t xml:space="preserve">I used to equate accountability with following procedure and answering for my own errors. Francis (2013) and Berwick (2013) showed that serious failures grew from cultures and systems, and Reason (2000) contrasts person and system approaches. Yet the Mental Capacity Act 2005 (s.1) still places personal duties on practitioners, such as presuming capacity, so systems thinking cannot dissolve individual responsibility. I therefore ask why a rule exists and where it fails, then follow it or challenge it through the proper route. That avoids blaming individuals for failures systems made likely, and excusing them by pointing to systems. When I questioned why one medication task needed two staff checks, my senior explained the safety reasoning, and I followed the medicines policy.</w:t>
+        <w:t xml:space="preserve">I used to equate accountability with following procedure and answering for my own errors. Francis (2013) and Berwick (2013) showed that serious failures grew from cultures and systems, and Reason (2000) contrasts person and system approaches. Yet the Mental Capacity Act 2005 (s.1) still places personal duties on practitioners, such as presuming capacity, so systems thinking cannot dissolve individual responsibility. I therefore ask why a rule exists and where it fails, then follow it or challenge it through the proper route. That avoids blaming individuals for failures systems made likely, and excusing them by pointing to systems. I asked why a safety check was needed before a care task. The registered nurse explained its purpose, and I followed the ward procedure.</w:t>
       </w:r>
     </w:p>
     <w:p>
@@ -137,7 +137,7 @@
         <w:t xml:space="preserve"> </w:t>
       </w:r>
       <w:r>
-        <w:t xml:space="preserve">I thought good care came from being a good carer. Nancarrow et al. (2013) identify team conditions, such as clear roles and communication, that no individual can supply alone, and West (2021) argues that compassionate leadership sustains them. The evidence is largely descriptive and hospital-based (Reeves et al., 2017), so transfer to social care is uncertain. My practice has shifted towards shaping how handovers and reporting work, not only performing my own tasks well. Influence over how a team works does not wait for a title; it starts with how I hand over, report and respond to a colleague’s doubt. I began recording changes in residents’ mobility and mood at handover, and a colleague said the clearer information helped them give consistent care.</w:t>
+        <w:t xml:space="preserve">I thought good care came from being a good carer. Nancarrow et al. (2013) identify team conditions, such as clear roles and communication, that no individual can supply alone, and West (2021) argues that compassionate leadership sustains them. The evidence is largely descriptive and hospital-based (Reeves et al., 2017), so transfer to social care is uncertain. My practice has shifted towards shaping how handovers and reporting work, not only performing my own tasks well. Influence over how a team works does not wait for a title; it starts with how I hand over, report and respond to a colleague’s doubt. I began sharing changes in patients’ mobility and mood at handover. A colleague said this helped them see who needed closer observation.</w:t>
       </w:r>
     </w:p>
     <w:bookmarkEnd w:id="21"/>
@@ -155,7 +155,7 @@
         <w:pStyle w:val="FirstParagraph"/>
       </w:pPr>
       <w:r>
-        <w:t xml:space="preserve">Dignity and choice often conflict with safety. I hold all three, so the useful question is how they are weighed. A resident wished to walk independently despite a recognised falls risk, which set their independence against their safety. I listened to their preference and sought guidance from a senior, and learned that person-centred care means balancing choice, assessed risk and proportionate safety measures.</w:t>
+        <w:t xml:space="preserve">Dignity and choice often conflict with safety. I hold all three, so the useful question is how they are weighed. On the ward, a patient wanted to walk independently despite an identified falls risk. I listened to their wishes and asked the registered nurse for guidance, and I learned that person-centred care means supporting informed choices with proportionate precautions based on assessed risk.</w:t>
       </w:r>
     </w:p>
     <w:p>
@@ -163,7 +163,7 @@
         <w:pStyle w:val="BodyText"/>
       </w:pPr>
       <w:r>
-        <w:t xml:space="preserve">The Mental Capacity Act 2005 (ss.1, 4) offers a structure: capacity is presumed, an unwise decision does not show incapacity, and decisions for a person lacking capacity follow their best interests. The Care Act 2014 (s.1) makes wellbeing the guiding principle, while Regulations 10 and 12 of the Health and Social Care Act 2008 (Regulated Activities) Regulations 2014 (regs. 10, 12) require dignity and safe care together. Beauchamp and Childress (2019) supply the vocabulary, but principles do not rank themselves, and the Skills for Care (2013) Code of Conduct does not say how to weigh a conflict.</w:t>
+        <w:t xml:space="preserve">The Mental Capacity Act 2005 (ss.1, 4) offers a structure: capacity is presumed, an unwise decision does not show incapacity, and decisions for a person lacking capacity follow their best interests. The Care Act 2014 (s.1) makes wellbeing the guiding principle, while Regulations 10 and 12 of the Health and Social Care Act 2008 (Regulated Activities) Regulations 2014 (regs. 10, 12) require dignity and safe care together. Beauchamp and Childress (2019) supply the vocabulary, but principles do not rank themselves, and the Skills for Care (2013) Code of Conduct states what workers must do without telling them how to weigh a conflict.</w:t>
       </w:r>
     </w:p>
     <w:p>
@@ -171,7 +171,7 @@
         <w:pStyle w:val="BodyText"/>
       </w:pPr>
       <w:r>
-        <w:t xml:space="preserve">Nepal and the UK show different costs. UK documentation and safeguarding systems create traceability and protection, but can consume time and, where fear of blame dominates, encourage defensive practice (Berwick, 2013). In the Nepali hospital settings I knew, resource limits meant that judgement and relationships carried more of the load, and protection depended more on individual conscience (Ministry of Health and Population, 2023). Both generalisations come from limited settings, so they are questions to test, not findings.</w:t>
+        <w:t xml:space="preserve">Nepal and the UK show different costs. UK documentation and safeguarding systems create traceability and protection, but can consume time and, where fear of blame dominates, encourage defensive practice (Berwick, 2013). In the Nepali hospitals I knew, resource limits meant judgement and relationships carried more of the load, and protection depended more on individual conscience (Ministry of Health and Population, 2023). Neither is superior, and both generalisations are questions to test, not findings.</w:t>
       </w:r>
     </w:p>
     <w:p>
@@ -215,7 +215,7 @@
         <w:pStyle w:val="FirstParagraph"/>
       </w:pPr>
       <w:r>
-        <w:t xml:space="preserve">I now claim that I act as a practitioner who notices, questions and escalates, and who records the reasoning so that others can learn from it. That claim can be tested against three behaviours: what I did when unsure, what I recorded, and whether I learned what happened next. Section 2 asks whether I did so under uncertainty and with limited status, and where my practice fell short.</w:t>
+        <w:t xml:space="preserve">My claim is that I notice, question and escalate, and record my reasoning so others can learn from it. I can test it against three behaviours: what I did when unsure, what I recorded, and whether I learned what happened next. Section 2 asks whether I did so under uncertainty and with limited status, and where my practice fell short.</w:t>
       </w:r>
     </w:p>
     <w:bookmarkEnd w:id="24"/>
@@ -243,7 +243,7 @@
         <w:pStyle w:val="FirstParagraph"/>
       </w:pPr>
       <w:r>
-        <w:t xml:space="preserve">This portfolio reflects on one episode from a formal, several-week college placement on an NHS hospital inpatient ward. The duration and defined task make it substantial; it is reflection on my own learning, not data collection. My task was to support documentation using an AI-supported imaging tool’s output. One flag appeared inconsistent, though I could not say why. I told my supervisor, saw no clear follow-up, and do not know the outcome. Details are altered and anonymised, with written permission from my college contact and the placement provider.</w:t>
+        <w:t xml:space="preserve">This portfolio reflects on one episode from a formal, several-week college placement on an NHS hospital inpatient ward. The duration and defined task make it substantial; it is reflection on my learning, not data collection. My task was to support documentation using an AI-supported imaging tool’s output. One flag appeared inconsistent, although I was unable to say exactly why. I told my supervisor, saw no clear follow-up, and do not know the outcome. Details are altered and anonymised, with written permission from my college contact and the placement provider.</w:t>
       </w:r>
     </w:p>
     <w:p>
@@ -287,7 +287,7 @@
         <w:t xml:space="preserve"> </w:t>
       </w:r>
       <w:r>
-        <w:t xml:space="preserve">I used the tool’s output to help complete documentation. A flag appeared inconsistent; I could not say why, only that it seemed off. I knew what the tool displayed. I did not know how it had been validated, what population it reflected, or whether the ward had checked it locally. I told my supervisor. I did not treat the flag as proof that anything was wrong: I kept the entry factual, recorded my own observations and asked for clarification instead of writing down an unverified conclusion.</w:t>
+        <w:t xml:space="preserve">I used the tool’s output to help complete documentation. A flag appeared inconsistent; I could not say why, only that it seemed off. I knew what the tool displayed but not how it had been validated, what population it reflected, or whether the ward had checked it locally. I told my supervisor. I did not treat the flag as confirmed evidence of a clinical problem: I kept my entry factual, recorded only observations relevant to my role, and asked for clarification instead of entering an unverified conclusion.</w:t>
       </w:r>
     </w:p>
     <w:p>
@@ -305,7 +305,7 @@
         <w:t xml:space="preserve"> </w:t>
       </w:r>
       <w:r>
-        <w:t xml:space="preserve">Such tools offer consistent attention to every image, flags that busy clinicians might miss, and time released for patient contact (Topol, 2019). I do not dispute this. My point is narrower: benefit depends on how output is used, because an over-trusted assistive tool adds a route to error while appearing to remove one.</w:t>
+        <w:t xml:space="preserve">Such tools offer consistent attention to every image, flags that busy clinicians might miss, and time released for patient contact (Topol, 2019). My point is narrower: benefit depends on how output is used, because an over-trusted assistive tool adds a route to error while appearing to remove one.</w:t>
       </w:r>
     </w:p>
     <w:p>
@@ -323,7 +323,7 @@
         <w:t xml:space="preserve"> </w:t>
       </w:r>
       <w:r>
-        <w:t xml:space="preserve">Three mechanisms matter. First, automation bias: people over-rely on automated advice, missing errors the tool misses and following errors it makes (Parasuraman and Manzey, 2010; Goddard, Roudsari and Wyatt, 2012). In mammography, Dratsch et al. (2023) found that incorrect AI suggestions lowered reader accuracy, especially for less experienced readers. Second, anchoring: an early value shapes later judgement (Tversky and Kahneman, 1974), and a flag displayed first is such a value. Third, performance does not travel automatically. Seyyed-Kalantari et al. (2021) found that chest radiograph algorithms underdiagnosed some under-served groups, so published accuracy may not describe a particular ward. These studies concern radiology readers or retrospective datasets, not students documenting on a ward, so they support caution, not prediction. In my situation the risk was error propagation: a flag copied into a record may later be read as a clinician’s finding, and a student deferring to both tool and hierarchy may be the person least likely to question it.</w:t>
+        <w:t xml:space="preserve">First, automation bias: people over-rely on automated advice, missing errors the tool misses and following errors it makes (Parasuraman and Manzey, 2010). Goddard, Roudsari and Wyatt (2012) found clinicians can follow incorrect advice, with mixed evidence on mitigations such as training. In mammography, Dratsch et al. (2023) found that incorrect AI suggestions lowered reader accuracy, especially for less experienced readers. Second, anchoring: an early value shapes later judgement (Tversky and Kahneman, 1974), and a flag displayed first is such a value. Third, performance does not travel automatically. Seyyed-Kalantari et al. (2021) found that chest radiograph algorithms underdiagnosed some under-served groups, so published accuracy may not describe a particular ward. These studies concern radiology readers or retrospective datasets, not students documenting on a ward, so they support caution, not prediction. In my situation the risk was error propagation: a flag copied into a record may later be read as a clinician’s finding. Anchoring meant a flag could shape what I wrote even if I doubted it, and a student deferring to both tool and hierarchy may be the person least likely to question it.</w:t>
       </w:r>
     </w:p>
     <w:p>
@@ -395,7 +395,7 @@
         <w:t xml:space="preserve"> </w:t>
       </w:r>
       <w:r>
-        <w:t xml:space="preserve">Diagnostic software is normally regulated as a medical device under the Medical Devices Regulations 2002, with guidance from the Medicines and Healthcare products Regulatory Agency (MHRA, 2023). The clinical safety standards DCB0129 (manufacturers) and DCB0160 (deploying organisations) require clinical risk management (NHS England, 2018). Providers must deliver safe care and treatment and operate good governance under Regulations 12 and 17 of the Health and Social Care Act 2008 (Regulated Activities) Regulations 2014. I do not know how the tool or the ward met these requirements and do not suggest they were unmet. My critical point is structural: this regime approves a product and requires local risk management, but safe use still depends on staff who understand the tool’s limits, and nothing I know of requires that a placement student is told them.</w:t>
+        <w:t xml:space="preserve">As 2.1 noted, diagnostic software is regulated as a medical device. The clinical safety standards DCB0129 (manufacturers) and DCB0160 (deploying organisations) require clinical risk management (NHS England, 2018). Providers must deliver safe care and treatment and operate good governance under Regulations 12 and 17 of the Health and Social Care Act 2008 (Regulated Activities) Regulations 2014. I do not know how the tool or the ward met these requirements and do not suggest they were unmet. My critical point is structural: this regime approves a product and requires local risk management, but safe use still depends on staff who understand the tool’s limits, and nothing I know of requires telling a placement student.</w:t>
       </w:r>
     </w:p>
     <w:p>
@@ -449,7 +449,7 @@
         <w:t xml:space="preserve"> </w:t>
       </w:r>
       <w:r>
-        <w:t xml:space="preserve">was my first conclusion, but it overstates what I could do. Checking should be proportionate and done by the right person: mine was to notice, question, escalate and avoid recording uncertain output as fact; a registered clinician’s extends to independent verification. Asking a question was within a student’s remit: it claims no authority and leaves the decision with the person who holds it. Employers carry duties too: Regulation 17 places governance responsibilities on providers, and the duty of candour (Regulation 20) operates at organisational level. Individual accountability without system support is unfair and unsafe.</w:t>
+        <w:t xml:space="preserve">was my first conclusion, but it overstates what I could do. Checking should be proportionate and done by the right person: mine was to notice, question, escalate and avoid recording uncertain output as fact; a registered clinician’s extends to independent verification. Asking a question was within a student’s remit, because a question claims no authority and leaves the decision with the person who holds it. Employers carry duties too: Regulation 17 places governance responsibilities on providers, and the duty of candour (Regulation 20) operates at organisational level. Individual accountability without system support is unfair.</w:t>
       </w:r>
     </w:p>
     <w:p>
@@ -467,7 +467,7 @@
         <w:t xml:space="preserve"> </w:t>
       </w:r>
       <w:r>
-        <w:t xml:space="preserve">Two implications go forward. A route for concerns that returns an outcome, and a convention marking AI-derived entries as unverified until confirmed. Both depend on induction that tells students what the tool cannot do.</w:t>
+        <w:t xml:space="preserve">Two implications follow: a route for concerns that returns an outcome, and a convention marking AI-derived entries as unverified until confirmed. Both need induction that tells students what the tool cannot do.</w:t>
       </w:r>
     </w:p>
     <w:bookmarkEnd w:id="27"/>
@@ -495,7 +495,7 @@
         <w:t xml:space="preserve"> </w:t>
       </w:r>
       <w:r>
-        <w:t xml:space="preserve">I told my supervisor during the same shift, saying that the flag did not match what I had observed and asking whether it could be checked before any decision was made. That was appropriate: I could not verify the output, and the person able to decide was reachable. Speaking up as a student is harder than the policy suggests. Francis (2015) found that NHS staff often felt unable to raise concerns, and the NHS Constitution (Department of Health and Social Care, 2023) affirms a right to do so. Edmondson (1999) defines psychological safety as a shared belief that interpersonal risk-taking is safe, and argues that it enables team learning. In hierarchical settings it is fragile: a student who is wrong risks embarrassment, and one who is right risks seeming to challenge a senior colleague’s reliance on the tool. I felt able to speak because I was asking for clarification, not accusing a colleague of a mistake, and I knew concerns about safety should be raised; I still felt uncertain about challenging a system that seemed authoritative.</w:t>
+        <w:t xml:space="preserve">I told my supervisor, the registered nurse in charge, during the same shift so the output could be reviewed promptly. I said the flag did not appear to match what I had observed, and asked whether it could be checked before anyone relied on it. The nurse acknowledged the concern. Speaking up as a student is harder than policy suggests: Francis (2015) found that NHS staff often felt unable to raise concerns, despite the right the NHS Constitution affirms (Department of Health and Social Care, 2023); power gradients work against a junior with only a feeling to report. Edmondson (1999) defines psychological safety as a shared belief that interpersonal risk-taking is safe, and argues that it enables team learning. In hierarchical settings it is fragile: a student who is wrong risks embarrassment, and one who is right risks seeming to challenge a senior colleague’s reliance on the tool. I felt able to speak because I was asking for clarification, not accusing anyone of a mistake, and patient safety came first. I still felt uncertain about questioning a system that looked authoritative.</w:t>
       </w:r>
     </w:p>
     <w:p>
@@ -513,7 +513,7 @@
         <w:t xml:space="preserve"> </w:t>
       </w:r>
       <w:r>
-        <w:t xml:space="preserve">SBAR gives structure: situation, background, assessment, recommendation (Haig, Sutton and Whittington, 2006). Applied here, it would have turned a feeling into a message: the flag appeared inconsistent; I was completing documentation; I could not say why; please check. A systematic review found the SBAR evidence to be mostly low-quality hospital studies (Müller et al., 2018), so I treat it as a useful prompt, not proof of safer care. Nancarrow et al. (2013) tie good teamwork to clear roles, communication and mutual respect, though Reeves et al. (2017) found the evidence limited and varied. Applying this to a student querying an AI output is my inference.</w:t>
+        <w:t xml:space="preserve">SBAR gives structure: situation, background, assessment, recommendation (Haig, Sutton and Whittington, 2006). Applied here, it would have turned a feeling into a message: the flag appeared inconsistent; I was completing documentation; I could not say why; please check. A systematic review found the SBAR evidence to be mostly low-quality hospital studies (Müller et al., 2018), so I treat it as a useful prompt, not proof of safer care. Nancarrow et al. (2013) tie good teamwork to clear roles, communication and mutual respect, though Reeves et al. (2017) found the evidence limited and varied. Applying it to a student querying an AI output is my inference.</w:t>
       </w:r>
     </w:p>
     <w:p>
@@ -531,7 +531,7 @@
         <w:t xml:space="preserve"> </w:t>
       </w:r>
       <w:r>
-        <w:t xml:space="preserve">Those with authority decide whether a student’s doubt is welcomed. West (2021) describes compassionate leadership as attending to, understanding and helping colleagues; applied here, supervisors would signal in advance that querying an AI output is expected, not merely tolerated. In the sources I read, leadership writing is largely normative and offers little evidence of effect on specific safety outcomes, so I treat it as a design principle, not a demonstrated remedy. For me it implies a future responsibility: to say at induction that questioning the tool is part of the job.</w:t>
+        <w:t xml:space="preserve">Those with authority decide whether a student’s doubt is welcomed. West (2021) describes compassionate leadership as attending to, understanding and helping colleagues; applied here, supervisors would signal in advance that querying an AI output is expected, not merely tolerated. In the sources I read, leadership writing is largely normative with little evidence on safety outcomes, so I treat it as a design principle, not a demonstrated remedy. For me it implies a future responsibility: to say at induction that questioning the tool is part of the job.</w:t>
       </w:r>
     </w:p>
     <w:p>
@@ -549,7 +549,7 @@
         <w:t xml:space="preserve"> </w:t>
       </w:r>
       <w:r>
-        <w:t xml:space="preserve">I do not know what happened. Staff may have checked and found nothing amiss, dealt with it without telling a student, or not pursued it; I cannot tell which, and confidentiality may legitimately limit what students are told. Silence is not evidence of inaction, but its effect on the person who spoke up is the same. Berwick (2013) and Reason (2000) place learning from concerns at the centre of safety. A concern with no visible outcome teaches that raising concerns achieves nothing, discouraging the next one and wasting the information; Francis (2015) reported that staff who spoke up often saw no action. A closed loop would acknowledge the concern, say who looked at it, and share whatever outcome can be shared anonymously.</w:t>
+        <w:t xml:space="preserve">I do not know what happened. Staff may have checked and found nothing amiss, dealt with it without telling a student, or not pursued it; I cannot tell which, and confidentiality may legitimately limit what students are told. Silence is not evidence of inaction, but the effect on the person who spoke up is the same. Berwick (2013) argues that a safe system learns from concerns, and Reason (2000) places organisational learning at the centre of safety. A concern with no visible outcome teaches that raising concerns achieves nothing, discouraging the next one; Francis (2015) reported that staff who spoke up often saw no action. A closed loop would acknowledge the concern, say who looked at it, and share whatever outcome can be shared anonymously.</w:t>
       </w:r>
     </w:p>
     <w:p>
@@ -567,7 +567,7 @@
         <w:t xml:space="preserve"> </w:t>
       </w:r>
       <w:r>
-        <w:t xml:space="preserve">I escalated under uncertainty, within my remit, without claiming knowledge I lacked. I could have done more: I did not ask how the tool was validated or when not to use it, or afterwards what had been found. I raised the concern verbally and made no separate written record. A short concern note (what I saw, why I was uncertain, whom I told and when) would have created a contemporaneous record and a basis for follow-up.</w:t>
+        <w:t xml:space="preserve">I escalated under uncertainty, within my remit, without claiming knowledge I lacked. I could have done more: I did not ask how the tool was validated or when not to use it, or afterwards what had been found. I raised the concern verbally and made no separate written record; I should have followed the ward’s incident-reporting and escalation procedures, without altering the clinical record inappropriately. A short concern note (what I saw, why I was uncertain, whom I told and when) would have created a contemporaneous record and a basis for follow-up.</w:t>
       </w:r>
     </w:p>
     <w:bookmarkEnd w:id="28"/>
@@ -595,7 +595,7 @@
         <w:t xml:space="preserve"> </w:t>
       </w:r>
       <w:r>
-        <w:t xml:space="preserve">UK GDPR Article 5(1)(d), applied through the Data Protection Act 2018, requires personal data to be accurate and, where necessary, kept up to date. Regulation 17(2)(c) requires accurate, complete and contemporaneous records (Health and Social Care Act 2008 (Regulated Activities) Regulations 2014). An AI flag recorded without qualification asserts something the service may not have verified, and later clinicians may read it as established. On my reading, whether this breaches the accuracy principle depends on how an entry is worded and verified, which I cannot assess for the ward. The NHS Records Management Code of Practice (NHS England, 2023) covers retention and handling, not wording.</w:t>
+        <w:t xml:space="preserve">UK GDPR Article 5(1)(d), applied through the Data Protection Act 2018, requires personal data to be accurate and, where necessary, kept up to date. Regulation 17(2)(c) requires accurate, complete and contemporaneous records. An AI flag recorded without qualification asserts something the service may not have verified, and later clinicians may read it as established. On my reading, whether this breaches the accuracy principle depends on how an entry is worded and verified, which I cannot assess for the ward. The NHS Records Management Code of Practice (NHS England, 2023) governs retention and handling, not how to word a record of uncertain AI output.</w:t>
       </w:r>
     </w:p>
     <w:p>
@@ -603,7 +603,7 @@
         <w:pStyle w:val="BodyText"/>
       </w:pPr>
       <w:r>
-        <w:t xml:space="preserve">Error propagation has a particular mechanism in records. Once an entry exists, later readers treat it as the product of professional judgement, because that is why records are trusted, and its AI origin may not be visible to them. Reason’s (2000) systems view locates the hazard in the pathway, where one uncertain output can pass through several hands without anyone owning its accuracy, not in any one person.</w:t>
+        <w:t xml:space="preserve">Error propagation has a particular mechanism in records. Once an entry exists, later readers treat it as professional judgement, and its AI origin may not be visible. Reason’s (2000) systems view locates the hazard in the pathway, where one uncertain output can pass through several hands without anyone owning its accuracy, not in any one person.</w:t>
       </w:r>
     </w:p>
     <w:p>
@@ -621,7 +621,7 @@
         <w:t xml:space="preserve"> </w:t>
       </w:r>
       <w:r>
-        <w:t xml:space="preserve">For direct care, the lawful basis under UK GDPR is usually public task (Article 6(1)(e)) with Article 9(2)(h) for health data, not consent (Information Commissioner’s Office, no date). Telling a patient that AI supports their imaging is therefore a transparency duty (UK GDPR, Articles 12 to 14), not a request for permission. The common-law duty of confidentiality and the Caldicott Principles, including that people should be informed about how their information is used (National Data Guardian, 2020), point the same way. Article 22 concerns decisions based solely on automated processing, and reforms in the Data (Use and Access) Act 2025 reshaped it, so the current text needs checking; where a clinician reviews the output, it is unlikely to be engaged on my reading. I do not know whether patients on the ward were told about the tool and will not guess.</w:t>
+        <w:t xml:space="preserve">For direct care, the lawful basis under UK GDPR is usually public task (Article 6(1)(e)) with Article 9(2)(h) for health data, not consent (Information Commissioner’s Office, no date). Telling a patient that AI supports their imaging is therefore a transparency duty (UK GDPR, Articles 12 to 14), not a request for permission. The common-law duty of confidentiality and the Caldicott Principles, which include informing people how their information is used (National Data Guardian, 2020), point the same way. Article 22 concerns decisions based solely on automated processing, and reforms in the Data (Use and Access) Act 2025 reshaped it, so the current text needs checking; where a clinician reviews the output, it is unlikely to be engaged on my reading. I do not know whether patients on the ward were told about the tool and will not guess.</w:t>
       </w:r>
     </w:p>
     <w:p>
@@ -639,7 +639,7 @@
         <w:t xml:space="preserve"> </w:t>
       </w:r>
       <w:r>
-        <w:t xml:space="preserve">The principles are clear, but practical instruction does not reach whoever writes the entry. Legislation and codes address controllers and registered professionals, and I am not aware of guidance telling a student how to word an AI-derived entry or record a concern without identifiers. Meaningful transparency would say, in plain language and at a usable moment, that software supports image reading, that a clinician reviews the output, and whom to ask. I know of no evidence that such notices change what patients understand here, so adequacy remains open. A counter-position holds that labelling AI-derived entries would clutter records and slow clinicians. That cost is real, and S2 addresses it by limiting the label to entries that influence decisions and lifting it on confirmation. The same discipline applies to this portfolio: it contains no record content, no identifiers and no product details, which is itself a confidentiality decision.</w:t>
+        <w:t xml:space="preserve">The principles are clear, but practical instruction does not reach whoever writes the entry. Legislation and codes address controllers and registered professionals, and I am not aware of guidance telling a student how to word an AI-derived entry or record a concern without identifiers. Transparency can also become a notice that exists without being understood. Meaningful transparency would say, plainly and at a usable moment, that software supports image reading, that a clinician reviews the output, and whom to ask. I know of no evidence that such notices change what patients understand here, so I treat adequacy as an open question. A counter-position holds that labelling AI-derived entries would clutter records and slow clinicians. That cost is real, so S2 limits the label to entries that influence decisions and lifts it on confirmation. The same discipline applies to this portfolio: it contains no record content, no identifiers and no product details, which is itself a confidentiality decision.</w:t>
       </w:r>
     </w:p>
     <w:bookmarkEnd w:id="29"/>
@@ -926,7 +926,7 @@
         <w:pStyle w:val="BodyText"/>
       </w:pPr>
       <w:r>
-        <w:t xml:space="preserve">I rank S1 first: it is cheap, repairs the broken feedback loop directly, and is offered to a service like mine, not as criticism of it. It could be tested on one ward for eight weeks as a plan-do-study-act cycle (Langley et al., 2009), measuring the share of concerns acknowledged within a set period and staff and student confidence to speak up. S1’s main weakness is that it can be completed without being used, and counting notes written would reward volume, so the pilot should also ask staff whether a concern changed what happened next. S3 follows because induction supports the others and should cover what to do when a tool seems wrong. S2 comes last because it needs governance agreement, and its benefit rests on my inference from the automation bias literature, not on direct evidence.</w:t>
+        <w:t xml:space="preserve">I rank S1 first: it is cheap, repairs the broken feedback loop directly, and is offered to a service like mine, not as criticism of it. As a small test it could run on one ward for eight weeks as a plan-do-study-act cycle (Langley et al., 2009), measuring the share of concerns acknowledged within a set period and staff and student confidence to speak up, and a review point. S1’s main weakness is that it can be completed without being used, and counting notes would reward volume, so the pilot should also ask staff whether a concern changed what happened next. S3 follows because induction supports the other two; it should include what to do when a tool seems wrong, since training that explains only benefits could increase deference. S2 comes last because it needs governance agreement, and its benefit rests on my inference from the automation bias literature, not on direct evidence.</w:t>
       </w:r>
     </w:p>
     <w:p>
@@ -962,7 +962,7 @@
         <w:pStyle w:val="FirstParagraph"/>
       </w:pPr>
       <w:r>
-        <w:t xml:space="preserve">At the time I felt unsure: the flag looked reliable but did not match what I had observed, and I worried about questioning information I did not fully understand. Analysis changed my conclusion. Before the placement I assumed that AI tools identify problems more accurately than people do and that a flagged result had probably already been checked. The evidence changed that: a second look is independent only if the human forms a view first; otherwise the flag anchors them (Tversky and Kahneman, 1974; Parasuraman and Manzey, 2010). I also believed that verifying meant checking the output. I now see it as noticing, questioning and escalating in proportion to my role.</w:t>
+        <w:t xml:space="preserve">My feelings at the time were uncertain: the flag looked reliable but did not match what I had observed, and I worried about questioning information I did not fully understand. Analysis changed my conclusion. Before the placement I assumed that AI tools identify clinical problems more accurately than people, and that a flagged result had probably been checked already. The evidence changed that: a second look is independent only if the human forms a view first; otherwise the flag anchors them (Tversky and Kahneman, 1974; Parasuraman and Manzey, 2010). I also believed that verifying meant checking the output. I now see it as noticing, questioning and escalating in proportion to my role.</w:t>
       </w:r>
     </w:p>
     <w:p>
@@ -970,7 +970,7 @@
         <w:pStyle w:val="BodyText"/>
       </w:pPr>
       <w:r>
-        <w:t xml:space="preserve">When asked to record AI-derived information, I will label it as AI-suggested and awaiting clinician confirmation, consistent with the accuracy principle and Regulation 17. When uncertain, I will tell my supervisor within the same shift using SBAR, and write a concern note without identifiers, as local policy allows. At the start of any placement using AI tools, I will ask how the tool was validated and when not to use it. A week after raising a concern, I will ask whether it has been closed, accepting that I may not be told the outcome.</w:t>
+        <w:t xml:space="preserve">My action plan is behavioural. When asked to record AI-derived information, I will label it as AI-suggested and awaiting clinician confirmation, consistent with the accuracy principle and Regulation 17. When uncertain, I will tell my supervisor within the same shift using SBAR, and write a concern note without identifiers, as local policy allows. At the start of any placement using AI tools, I will ask how the tool was validated and when not to use it. A week after raising a concern, I will ask whether it has been closed, accepting that I may not be told the outcome.</w:t>
       </w:r>
     </w:p>
     <w:p>
@@ -978,7 +978,7 @@
         <w:pStyle w:val="BodyText"/>
       </w:pPr>
       <w:r>
-        <w:t xml:space="preserve">These behaviours help only if the people around me can sustain them, which requires knowledge of governance, quality improvement and leadership and shapes Section 3. The learning also has limits: one episode cannot show how I would act in a different team, or when my doubt is stronger and the person who can decide is harder to reach. I will test the plan through supervisor feedback in my next role.</w:t>
+        <w:t xml:space="preserve">These behaviours help only if the people around me can sustain them, which requires knowledge of governance, quality improvement and leadership and shapes Section 3. The learning also has limits: one episode cannot show how I would act in a different team, or when the person who can decide is harder to reach. I will test the plan through supervisor feedback in my next role.</w:t>
       </w:r>
     </w:p>
     <w:bookmarkEnd w:id="31"/>
@@ -1006,7 +1006,7 @@
         <w:pStyle w:val="FirstParagraph"/>
       </w:pPr>
       <w:r>
-        <w:t xml:space="preserve">Within 12 months I aim to move towards a senior care assistant post in the UK if a suitable opportunity arises, within two to three years towards a team-leader or care-quality role, and in the long term to contribute to services in Nepal, particularly staff training, accountability and person-centred practice. My immediate interest is adult social care, though I would consider hospital or community care if training and opportunities allowed.</w:t>
+        <w:t xml:space="preserve">Within 12 months I aim to strengthen my practice in person-centred care, safeguarding, documentation, infection prevention and communication in an NHS hospital, and to build the competencies to apply for a senior support role when eligible. Within two to three years I hope to move towards a supervisory, team-leadership or healthcare quality role. In the long term I want to contribute to services in Nepal, particularly staff development, patient safety and accountability.</w:t>
       </w:r>
     </w:p>
     <w:p>
@@ -1014,7 +1014,7 @@
         <w:pStyle w:val="BodyText"/>
       </w:pPr>
       <w:r>
-        <w:t xml:space="preserve">I appraised four options for fit with Section 2, entry requirements, time and cost, and visa feasibility. (i) Senior care assistant or team leader fits my existing experience and sits where handovers, induction and concern routes are set. (ii) Deputy or registered manager, through the Level 5 Diploma in Leadership and Management for Adult Care (Skills for Care, no date), has high fit but expects supervisory experience I lack. (iii) Postgraduate study in health management or policy would address the governance gap but costs more time and money. (iv) Nursing registration is attractive, but I must check Nursing and Midwifery Council (NMC) overseas requirements against my PCL qualification (Nursing and Midwifery Council, no date) and do not assume eligibility. I choose (i) because it is the earliest point at which I can apply S1 and S3 at team level; S2 needs organisational governance, so it comes later.</w:t>
+        <w:t xml:space="preserve">I appraised four options for fit with Section 2, entry requirements, time and cost, and visa feasibility. (i) A senior support or team-leader role in a hospital fits my experience and sits where handovers, induction and concern routes are set. (ii) A supervisory or coordination role, supported by a leadership qualification such as the Level 5 Diploma in Leadership and Management for Adult Care (Skills for Care, no date), has high fit but expects supervisory experience I lack. (iii) Postgraduate study in health management or policy would address the governance gap but costs more time and money. (iv) Nursing registration is attractive, but I must check Nursing and Midwifery Council (NMC) overseas requirements against my PCL qualification (Nursing and Midwifery Council, no date) and do not assume eligibility. I choose (i) because it is the earliest point at which I can apply S1 and S3 at team level; S2 needs organisational governance, so it comes later. The other options are deferred, not dismissed.</w:t>
       </w:r>
     </w:p>
     <w:p>
@@ -1022,25 +1022,7 @@
         <w:pStyle w:val="BodyText"/>
       </w:pPr>
       <w:r>
-        <w:t xml:space="preserve">I will present this identity to employers through a CV, supervisor references and a short profile.</w:t>
-      </w:r>
-      <w:r>
-        <w:t xml:space="preserve"> </w:t>
-      </w:r>
-      <w:r>
-        <w:t xml:space="preserve">“</w:t>
-      </w:r>
-      <w:r>
-        <w:t xml:space="preserve">Personal branding</w:t>
-      </w:r>
-      <w:r>
-        <w:t xml:space="preserve">”</w:t>
-      </w:r>
-      <w:r>
-        <w:t xml:space="preserve"> </w:t>
-      </w:r>
-      <w:r>
-        <w:t xml:space="preserve">language can reward self-presentation over practice, so I will evidence practice, such as feedback and a completed improvement cycle, not adjectives.</w:t>
+        <w:t xml:space="preserve">To present this identity to employers I will use a CV, supervisor references and a short profile that evidence practice, such as feedback and a completed improvement cycle, not adjectives.</w:t>
       </w:r>
     </w:p>
     <w:bookmarkEnd w:id="33"/>
@@ -1064,14 +1046,14 @@
     <w:tbl>
       <w:tblPr>
         <w:tblStyle w:val="Table"/>
-        <w:tblW w:type="pct" w:w="5000"/>
+        <w:tblW w:type="pct" w:w="4943"/>
         <w:tblLook w:firstRow="1" w:lastRow="0" w:firstColumn="0" w:lastColumn="0" w:noHBand="0" w:noVBand="0" w:val="0020"/>
         <w:jc w:val="start"/>
       </w:tblPr>
       <w:tblGrid>
-        <w:gridCol w:w="2640"/>
-        <w:gridCol w:w="2640"/>
-        <w:gridCol w:w="2640"/>
+        <w:gridCol w:w="2715"/>
+        <w:gridCol w:w="3168"/>
+        <w:gridCol w:w="1946"/>
       </w:tblGrid>
       <w:tr>
         <w:trPr>
@@ -1149,7 +1131,7 @@
               <w:jc w:val="left"/>
             </w:pPr>
             <w:r>
-              <w:t xml:space="preserve">Care-home practice: recording changes in mobility and mood at handover, with a colleague’s feedback that it helped consistent care; escalation in Section 2</w:t>
+              <w:t xml:space="preserve">Handover updates valued by a colleague (1.2); Section 2 escalation</w:t>
             </w:r>
           </w:p>
         </w:tc>
@@ -1197,7 +1179,7 @@
               <w:jc w:val="left"/>
             </w:pPr>
             <w:r>
-              <w:t xml:space="preserve">Care-home practice: adjusting a breakfast routine to a resident’s preference (1.2); the walking-independence case (1.3)</w:t>
+              <w:t xml:space="preserve">Washing time adjusted to a patient’s routine (1.2)</w:t>
             </w:r>
           </w:p>
         </w:tc>
@@ -1245,7 +1227,7 @@
               <w:jc w:val="left"/>
             </w:pPr>
             <w:r>
-              <w:t xml:space="preserve">About 20 hours of work and 25 to 27 hours of study or classes a week; results [YOU SUPPLY: results]</w:t>
+              <w:t xml:space="preserve">About 20 h work, 25 to 27 h study a week; [YOU SUPPLY: results]</w:t>
             </w:r>
           </w:p>
         </w:tc>
@@ -1293,7 +1275,7 @@
               <w:jc w:val="left"/>
             </w:pPr>
             <w:r>
-              <w:t xml:space="preserve">Completed safeguarding training covering recognising abuse or neglect, reporting and procedures; level held [YOU SUPPLY: level]</w:t>
+              <w:t xml:space="preserve">[YOU SUPPLY: training level held]</w:t>
             </w:r>
           </w:p>
         </w:tc>
@@ -1485,7 +1467,7 @@
               <w:jc w:val="left"/>
             </w:pPr>
             <w:r>
-              <w:t xml:space="preserve">[YOU SUPPLY: evidence, or state none yet]</w:t>
+              <w:t xml:space="preserve">[YOU SUPPLY: evidence]</w:t>
             </w:r>
           </w:p>
         </w:tc>
@@ -1724,7 +1706,7 @@
               <w:jc w:val="left"/>
             </w:pPr>
             <w:r>
-              <w:t xml:space="preserve">Secure a senior or team-leader post if available; enrol on a Level 3 or 5 adult-care leadership qualification; build an improvement evidence file; review the plan with my mentor</w:t>
+              <w:t xml:space="preserve">Apply for a senior support or team-leader post when eligible; enrol on a leadership qualification; build an improvement evidence file; review the plan with my mentor</w:t>
             </w:r>
           </w:p>
         </w:tc>
@@ -1736,7 +1718,7 @@
               <w:jc w:val="left"/>
             </w:pPr>
             <w:r>
-              <w:t xml:space="preserve">Offer; enrolment; file</w:t>
+              <w:t xml:space="preserve">Application; enrolment; file</w:t>
             </w:r>
           </w:p>
         </w:tc>
@@ -1809,7 +1791,7 @@
         <w:pStyle w:val="BodyText"/>
       </w:pPr>
       <w:r>
-        <w:t xml:space="preserve">Three checks keep the plan honest: every action names a gap from 3.2, every goal has evidence someone else can inspect, and each quarterly review asks what I would drop. My first improvement project will be a small trial of the S1 concern-and-closure routine. Each course is linked to a named gap, and I expect to graduate in 2027 and will set firm dates around that.</w:t>
+        <w:t xml:space="preserve">Three checks keep the plan honest: every action names a gap from 3.2, every goal has evidence someone else can inspect, and each quarterly review asks what I would drop. My first improvement project will be a small trial of the S1 concern-and-closure routine. Each course is linked to a named gap, and I will set real dates around my expected graduation in 2027.</w:t>
       </w:r>
     </w:p>
     <w:bookmarkEnd w:id="35"/>

</xml_diff>

<commit_message>
Style hyperlinks as blue underlined
Co-Authored-By: Claude Sonnet 5.5 <noreply@anthropic.com>
Claude-Session: https://claude.ai/code/session_01GPDgMcFkQEKAntj1yaW626
</commit_message>
<xml_diff>
--- a/Professional_Portfolio_-_Final.docx
+++ b/Professional_Portfolio_-_Final.docx
@@ -15336,6 +15336,16 @@
     <w:basedOn w:val="VerbatimChar"/>
     <w:rPr/>
   </w:style>
+  <w:style w:type="character" w:styleId="Hyperlink">
+    <w:name w:val="Hyperlink"/>
+    <w:basedOn w:val="DefaultParagraphFont"/>
+    <w:uiPriority w:val="99"/>
+    <w:unhideWhenUsed/>
+    <w:rPr>
+      <w:color w:val="0563C1"/>
+      <w:u w:val="single"/>
+    </w:rPr>
+  </w:style>
 </w:styles>
 </file>
 

</xml_diff>